<commit_message>
fix: correct data indexing and realign features with labels
</commit_message>
<xml_diff>
--- a/report.docx
+++ b/report.docx
@@ -39,7 +39,6 @@
         <w:spacing w:before="80"/>
         <w:jc w:val="center"/>
         <w:rPr>
-          <w:rFonts w:hint="cs"/>
           <w:rtl/>
         </w:rPr>
       </w:pPr>
@@ -136,7 +135,7 @@
         <w:rPr>
           <w:rtl/>
         </w:rPr>
-        <w:t>המודל המנצח — יער אקראי (Random Forest) — השיג על סט המבחן הסופי והנעול דיוק של 97.99%, תוצאה המעידה על יכולת הכללה מצוינת ועל איתנות הנדסת המאפיינים שביצענו.</w:t>
+        <w:t>המודל המנצח — יער אקראי (Random Forest) — השיג על סט המבחן הסופי והנעול דיוק של 98.01%, תוצאה המעידה על יכולת הכללה מצוינת ועל איתנות הנדסת המאפיינים שביצענו.</w:t>
       </w:r>
     </w:p>
     <w:p>
@@ -610,7 +609,7 @@
         <w:rPr>
           <w:rtl/>
         </w:rPr>
-        <w:t>מסקנת המחקר העלתה כי התצורה של היער האקראי ללא הגבלת עומק מלאכותית (Unrestricted Random Forest) סיפקה את ניהול הרעש הסטטיסטי האופטימלי ביותר.</w:t>
+        <w:t>מסקנת המחקר העלתה כי הגבלת עומק מתונה של היער האקראי (max_depth=20) סיפקה את האיזון הטוב ביותר — צמצום שינון-היתר תוך שמירה על דיוק הוולידציה הגבוה.</w:t>
       </w:r>
     </w:p>
     <w:p>
@@ -655,7 +654,7 @@
           <w:szCs w:val="32"/>
           <w:rtl/>
         </w:rPr>
-        <w:t>דיוק סופי על סט המבחן: 97.99%</w:t>
+        <w:t>דיוק סופי על סט המבחן: 98.01%</w:t>
       </w:r>
     </w:p>
     <w:p>
@@ -695,12 +694,6 @@
         <w:gridCol w:w="1665"/>
       </w:tblGrid>
       <w:tr>
-        <w:tblPrEx>
-          <w:tblCellMar>
-            <w:top w:w="0" w:type="dxa"/>
-            <w:bottom w:w="0" w:type="dxa"/>
-          </w:tblCellMar>
-        </w:tblPrEx>
         <w:trPr>
           <w:tblHeader/>
         </w:trPr>
@@ -861,12 +854,6 @@
         </w:tc>
       </w:tr>
       <w:tr>
-        <w:tblPrEx>
-          <w:tblCellMar>
-            <w:top w:w="0" w:type="dxa"/>
-            <w:bottom w:w="0" w:type="dxa"/>
-          </w:tblCellMar>
-        </w:tblPrEx>
         <w:tc>
           <w:tcPr>
             <w:tcW w:w="2700" w:type="dxa"/>
@@ -921,7 +908,7 @@
                 <w:szCs w:val="20"/>
                 <w:rtl/>
               </w:rPr>
-              <w:t>0.98</w:t>
+              <w:t>0.99</w:t>
             </w:r>
           </w:p>
         </w:tc>
@@ -949,7 +936,7 @@
                 <w:szCs w:val="20"/>
                 <w:rtl/>
               </w:rPr>
-              <w:t>0.99</w:t>
+              <w:t>1.00</w:t>
             </w:r>
           </w:p>
         </w:tc>
@@ -977,7 +964,7 @@
                 <w:szCs w:val="20"/>
                 <w:rtl/>
               </w:rPr>
-              <w:t>0.98</w:t>
+              <w:t>1.00</w:t>
             </w:r>
           </w:p>
         </w:tc>
@@ -1005,18 +992,12 @@
                 <w:szCs w:val="20"/>
                 <w:rtl/>
               </w:rPr>
-              <w:t>5,945</w:t>
+              <w:t>2,159</w:t>
             </w:r>
           </w:p>
         </w:tc>
       </w:tr>
       <w:tr>
-        <w:tblPrEx>
-          <w:tblCellMar>
-            <w:top w:w="0" w:type="dxa"/>
-            <w:bottom w:w="0" w:type="dxa"/>
-          </w:tblCellMar>
-        </w:tblPrEx>
         <w:tc>
           <w:tcPr>
             <w:tcW w:w="2700" w:type="dxa"/>
@@ -1073,7 +1054,7 @@
                 <w:szCs w:val="20"/>
                 <w:rtl/>
               </w:rPr>
-              <w:t>0.97</w:t>
+              <w:t>0.98</w:t>
             </w:r>
           </w:p>
         </w:tc>
@@ -1102,7 +1083,7 @@
                 <w:szCs w:val="20"/>
                 <w:rtl/>
               </w:rPr>
-              <w:t>0.93</w:t>
+              <w:t>0.99</w:t>
             </w:r>
           </w:p>
         </w:tc>
@@ -1131,7 +1112,7 @@
                 <w:szCs w:val="20"/>
                 <w:rtl/>
               </w:rPr>
-              <w:t>0.95</w:t>
+              <w:t>0.98</w:t>
             </w:r>
           </w:p>
         </w:tc>
@@ -1160,18 +1141,12 @@
                 <w:szCs w:val="20"/>
                 <w:rtl/>
               </w:rPr>
-              <w:t>1,896</w:t>
+              <w:t>5,945</w:t>
             </w:r>
           </w:p>
         </w:tc>
       </w:tr>
       <w:tr>
-        <w:tblPrEx>
-          <w:tblCellMar>
-            <w:top w:w="0" w:type="dxa"/>
-            <w:bottom w:w="0" w:type="dxa"/>
-          </w:tblCellMar>
-        </w:tblPrEx>
         <w:tc>
           <w:tcPr>
             <w:tcW w:w="2700" w:type="dxa"/>
@@ -1226,7 +1201,7 @@
                 <w:szCs w:val="20"/>
                 <w:rtl/>
               </w:rPr>
-              <w:t>0.99</w:t>
+              <w:t>0.97</w:t>
             </w:r>
           </w:p>
         </w:tc>
@@ -1254,7 +1229,7 @@
                 <w:szCs w:val="20"/>
                 <w:rtl/>
               </w:rPr>
-              <w:t>1.00</w:t>
+              <w:t>0.93</w:t>
             </w:r>
           </w:p>
         </w:tc>
@@ -1282,7 +1257,7 @@
                 <w:szCs w:val="20"/>
                 <w:rtl/>
               </w:rPr>
-              <w:t>1.00</w:t>
+              <w:t>0.95</w:t>
             </w:r>
           </w:p>
         </w:tc>
@@ -1310,18 +1285,12 @@
                 <w:szCs w:val="20"/>
                 <w:rtl/>
               </w:rPr>
-              <w:t>2,159</w:t>
+              <w:t>1,896</w:t>
             </w:r>
           </w:p>
         </w:tc>
       </w:tr>
       <w:tr>
-        <w:tblPrEx>
-          <w:tblCellMar>
-            <w:top w:w="0" w:type="dxa"/>
-            <w:bottom w:w="0" w:type="dxa"/>
-          </w:tblCellMar>
-        </w:tblPrEx>
         <w:tc>
           <w:tcPr>
             <w:tcW w:w="2700" w:type="dxa"/>
@@ -1453,12 +1422,6 @@
         </w:tc>
       </w:tr>
       <w:tr>
-        <w:tblPrEx>
-          <w:tblCellMar>
-            <w:top w:w="0" w:type="dxa"/>
-            <w:bottom w:w="0" w:type="dxa"/>
-          </w:tblCellMar>
-        </w:tblPrEx>
         <w:tc>
           <w:tcPr>
             <w:tcW w:w="2700" w:type="dxa"/>
@@ -1603,12 +1566,6 @@
         </w:tc>
       </w:tr>
       <w:tr>
-        <w:tblPrEx>
-          <w:tblCellMar>
-            <w:top w:w="0" w:type="dxa"/>
-            <w:bottom w:w="0" w:type="dxa"/>
-          </w:tblCellMar>
-        </w:tblPrEx>
         <w:tc>
           <w:tcPr>
             <w:tcW w:w="2700" w:type="dxa"/>
@@ -1789,7 +1746,7 @@
         <w:rPr>
           <w:rtl/>
         </w:rPr>
-        <w:t>קוואזרים (QSO) זוהו כמעט בשלמות (Recall של 1.00) — תוצאה המאשרת ישירות את החלטת הנדסת המאפיינים שלנו: מדדי הצבע בידדו את החותמת האולטרה-סגולה הייחודית של הקוואזרים.</w:t>
+        <w:t>כוכבים (STAR) זוהו כמעט בשלמות (Recall של 1.00) — תוצאה המאשרת שהם מבודדים היטב משאר העצמים בזכות חתימת ה-redshift הנמוכה שלהם, המבדילה אותם בבירור מהגלקסיות והקוואזרים החוץ-גלקטיים.</w:t>
       </w:r>
     </w:p>
     <w:p>
@@ -1806,7 +1763,7 @@
         <w:rPr>
           <w:rtl/>
         </w:rPr>
-        <w:t>כוכבים (STAR) קיבלו ציוני דיוק גבוהים ויציבים (F1 של 0.98) על פני המחלקה הגדולה ביותר בסט (5,945 תצפיות).</w:t>
+        <w:t>גלקסיות (GALAXY) קיבלו ציוני דיוק גבוהים ויציבים (F1 של 0.98) על פני המחלקה הגדולה ביותר בסט (5,945 תצפיות).</w:t>
       </w:r>
     </w:p>
     <w:p>
@@ -1823,7 +1780,7 @@
         <w:rPr>
           <w:rtl/>
         </w:rPr>
-        <w:t>גלקסיות (GALAXY) הציגו את ה-Recall הנמוך ביותר (0.93), הפער הצפוי ביותר מבחינה פיזיקלית בשל חפיפה ספקטרלית מסוימת מול הכוכבים — אך עדיין ברמת F1 גבוהה של 0.95.</w:t>
+        <w:t>קוואזרים (QSO) הציגו את ה-Recall הנמוך ביותר (0.93), הפער הצפוי ביותר מבחינה פיזיקלית בשל חפיפה ספקטרלית מסוימת מול הגלקסיות — אך עדיין ברמת F1 גבוהה של 0.95.</w:t>
       </w:r>
     </w:p>
     <w:p>
@@ -1840,7 +1797,7 @@
         <w:rPr>
           <w:rtl/>
         </w:rPr>
-        <w:t>הפער הקטן בין הדיוק על סט המבחן (97.99%) לבין הביצועים בולידציה מעיד שהמודל לא סבל מהתאמת יתר אלא הכליל היטב לנתונים חדשים לחלוטין.</w:t>
+        <w:t>הפער הקטן בין הדיוק על סט המבחן (98.01%) לבין הביצועים בולידציה מעיד שהמודל לא סבל מהתאמת יתר אלא הכליל היטב לנתונים חדשים לחלוטין.</w:t>
       </w:r>
     </w:p>
     <w:p>
@@ -2006,7 +1963,7 @@
         <w:rPr>
           <w:rtl/>
         </w:rPr>
-        <w:t>הפרדה נכונה של הנתונים = הערכה אמינה: נעילת סט המבחן עד הסוף סיפקה מדד דיוק אובייקטיבי של 97.99% נטול דליפת מידע (Data Leakage).</w:t>
+        <w:t>הפרדה נכונה של הנתונים = הערכה אמינה: נעילת סט המבחן עד הסוף סיפקה מדד דיוק אובייקטיבי של 98.01% נטול דליפת מידע (Data Leakage).</w:t>
       </w:r>
     </w:p>
     <w:p>

</xml_diff>